<commit_message>
Commit automatico 01/03/2026 20:18:56,40
</commit_message>
<xml_diff>
--- a/Telecomunicazioni/Laboratorio/Relazioni/Relazione N°3 Matteo Porcu 4^BINF.docx
+++ b/Telecomunicazioni/Laboratorio/Relazioni/Relazione N°3 Matteo Porcu 4^BINF.docx
@@ -59,7 +59,7 @@
                                 <w:szCs w:val="32"/>
                               </w:rPr>
                             </w:pPr>
-                            <w:hyperlink r:id="rId5" w:tooltip="vai alla homepage" w:history="1">
+                            <w:hyperlink r:id="rId6" w:tooltip="vai alla homepage" w:history="1">
                               <w:r>
                                 <w:rPr>
                                   <w:rStyle w:val="Collegamentoipertestuale"/>
@@ -147,7 +147,7 @@
                           <w:szCs w:val="32"/>
                         </w:rPr>
                       </w:pPr>
-                      <w:hyperlink r:id="rId6" w:tooltip="vai alla homepage" w:history="1">
+                      <w:hyperlink r:id="rId7" w:tooltip="vai alla homepage" w:history="1">
                         <w:r>
                           <w:rPr>
                             <w:rStyle w:val="Collegamentoipertestuale"/>
@@ -159,20 +159,7 @@
                             <w:szCs w:val="32"/>
                             <w:u w:val="none"/>
                           </w:rPr>
-                          <w:t>Istituto di Istruzione Superiore</w:t>
-                        </w:r>
-                        <w:r>
-                          <w:rPr>
-                            <w:rStyle w:val="Collegamentoipertestuale"/>
-                            <w:rFonts w:asciiTheme="majorHAnsi" w:hAnsiTheme="majorHAnsi"/>
-                            <w:b/>
-                            <w:bCs/>
-                            <w:color w:val="auto"/>
-                            <w:sz w:val="32"/>
-                            <w:szCs w:val="32"/>
-                            <w:u w:val="none"/>
-                          </w:rPr>
-                          <w:t xml:space="preserve"> </w:t>
+                          <w:t xml:space="preserve">Istituto di Istruzione Superiore </w:t>
                         </w:r>
                         <w:r>
                           <w:rPr>
@@ -198,33 +185,7 @@
                             <w:szCs w:val="32"/>
                             <w:u w:val="none"/>
                           </w:rPr>
-                          <w:t>Fermi</w:t>
-                        </w:r>
-                        <w:r>
-                          <w:rPr>
-                            <w:rStyle w:val="Collegamentoipertestuale"/>
-                            <w:rFonts w:asciiTheme="majorHAnsi" w:hAnsiTheme="majorHAnsi"/>
-                            <w:b/>
-                            <w:bCs/>
-                            <w:color w:val="auto"/>
-                            <w:sz w:val="32"/>
-                            <w:szCs w:val="32"/>
-                            <w:u w:val="none"/>
-                          </w:rPr>
-                          <w:t xml:space="preserve"> sede Via Falcone</w:t>
-                        </w:r>
-                        <w:r>
-                          <w:rPr>
-                            <w:rStyle w:val="Collegamentoipertestuale"/>
-                            <w:rFonts w:asciiTheme="majorHAnsi" w:hAnsiTheme="majorHAnsi"/>
-                            <w:b/>
-                            <w:bCs/>
-                            <w:color w:val="auto"/>
-                            <w:sz w:val="32"/>
-                            <w:szCs w:val="32"/>
-                            <w:u w:val="none"/>
-                          </w:rPr>
-                          <w:t xml:space="preserve"> Iglesias </w:t>
+                          <w:t xml:space="preserve">Fermi sede Via Falcone Iglesias </w:t>
                         </w:r>
                       </w:hyperlink>
                     </w:p>
@@ -435,11 +396,7 @@
           </mc:Choice>
           <mc:Fallback>
             <w:pict>
-              <v:shapetype w14:anchorId="464CB736" id="_x0000_t202" coordsize="21600,21600" o:spt="202" path="m,l,21600r21600,l21600,xe">
-                <v:stroke joinstyle="miter"/>
-                <v:path gradientshapeok="t" o:connecttype="rect"/>
-              </v:shapetype>
-              <v:shape id="_x0000_s1027" type="#_x0000_t202" style="position:absolute;margin-left:85.5pt;margin-top:27.85pt;width:437.2pt;height:37.5pt;z-index:251661312;visibility:visible;mso-wrap-style:square;mso-width-percent:0;mso-height-percent:0;mso-wrap-distance-left:9pt;mso-wrap-distance-top:3.6pt;mso-wrap-distance-right:9pt;mso-wrap-distance-bottom:3.6pt;mso-position-horizontal:absolute;mso-position-horizontal-relative:margin;mso-position-vertical:absolute;mso-position-vertical-relative:text;mso-width-percent:0;mso-height-percent:0;mso-width-relative:margin;mso-height-relative:margin;v-text-anchor:top" o:gfxdata="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" filled="f" stroked="f">
+              <v:shape w14:anchorId="464CB736" id="_x0000_s1027" type="#_x0000_t202" style="position:absolute;margin-left:85.5pt;margin-top:27.85pt;width:437.2pt;height:37.5pt;z-index:251661312;visibility:visible;mso-wrap-style:square;mso-width-percent:0;mso-height-percent:0;mso-wrap-distance-left:9pt;mso-wrap-distance-top:3.6pt;mso-wrap-distance-right:9pt;mso-wrap-distance-bottom:3.6pt;mso-position-horizontal:absolute;mso-position-horizontal-relative:margin;mso-position-vertical:absolute;mso-position-vertical-relative:text;mso-width-percent:0;mso-height-percent:0;mso-width-relative:margin;mso-height-relative:margin;v-text-anchor:top" o:gfxdata="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" filled="f" stroked="f">
                 <v:textbox>
                   <w:txbxContent>
                     <w:p>
@@ -522,7 +479,7 @@
                     </pic:cNvPicPr>
                   </pic:nvPicPr>
                   <pic:blipFill>
-                    <a:blip r:embed="rId7" cstate="print">
+                    <a:blip r:embed="rId8" cstate="print">
                       <a:extLst>
                         <a:ext uri="{28A0092B-C50C-407E-A947-70E740481C1C}">
                           <a14:useLocalDpi xmlns:a14="http://schemas.microsoft.com/office/drawing/2010/main" val="0"/>
@@ -568,10 +525,10 @@
         <w:tblLook w:val="04A0" w:firstRow="1" w:lastRow="0" w:firstColumn="1" w:lastColumn="0" w:noHBand="0" w:noVBand="1"/>
       </w:tblPr>
       <w:tblGrid>
-        <w:gridCol w:w="2121"/>
-        <w:gridCol w:w="3682"/>
-        <w:gridCol w:w="1849"/>
-        <w:gridCol w:w="2804"/>
+        <w:gridCol w:w="2109"/>
+        <w:gridCol w:w="3633"/>
+        <w:gridCol w:w="1945"/>
+        <w:gridCol w:w="2769"/>
       </w:tblGrid>
       <w:tr>
         <w:tc>
@@ -650,7 +607,6 @@
               </w:rPr>
               <w:t>Classe/</w:t>
             </w:r>
-            <w:proofErr w:type="spellStart"/>
             <w:r>
               <w:rPr>
                 <w:b/>
@@ -658,9 +614,8 @@
                 <w:sz w:val="32"/>
                 <w:szCs w:val="32"/>
               </w:rPr>
-              <w:t>Sez</w:t>
-            </w:r>
-            <w:proofErr w:type="spellEnd"/>
+              <w:t>Sez.</w:t>
+            </w:r>
           </w:p>
         </w:tc>
         <w:tc>
@@ -869,8 +824,6 @@
             <w:r>
               <w:rPr>
                 <w:rFonts w:ascii="Tahoma" w:hAnsi="Tahoma" w:cs="Tahoma"/>
-                <w:sz w:val="28"/>
-                <w:szCs w:val="28"/>
               </w:rPr>
               <w:t>Impianto Semaforico</w:t>
             </w:r>
@@ -922,10 +875,74 @@
             <w:pPr>
               <w:rPr>
                 <w:rFonts w:ascii="Tahoma" w:hAnsi="Tahoma" w:cs="Tahoma"/>
-                <w:sz w:val="28"/>
-                <w:szCs w:val="28"/>
               </w:rPr>
             </w:pPr>
+            <w:r>
+              <w:rPr>
+                <w:rFonts w:ascii="Tahoma" w:hAnsi="Tahoma" w:cs="Tahoma"/>
+              </w:rPr>
+              <w:t>Il progetto ha come obiettivo la progettazione e la simulazione di un impianto semaforico intelligente capace di gestire due incroci stradali e un attraversamento pedonale con pulsante di richiesta.</w:t>
+            </w:r>
+            <w:r>
+              <w:rPr>
+                <w:rFonts w:ascii="Tahoma" w:hAnsi="Tahoma" w:cs="Tahoma"/>
+              </w:rPr>
+              <w:t xml:space="preserve"> </w:t>
+            </w:r>
+            <w:r>
+              <w:rPr>
+                <w:rFonts w:ascii="Tahoma" w:hAnsi="Tahoma" w:cs="Tahoma"/>
+              </w:rPr>
+              <w:t>Il sistema è stato realizzato usando la scheda Arduino Uno e simulato tramite la piattaforma Tinkercad, che permette di testare il circuito in modo virtuale prima di una possibile realizzazione reale.</w:t>
+            </w:r>
+            <w:r>
+              <w:rPr>
+                <w:rFonts w:ascii="Tahoma" w:hAnsi="Tahoma" w:cs="Tahoma"/>
+              </w:rPr>
+              <w:t xml:space="preserve"> </w:t>
+            </w:r>
+            <w:r>
+              <w:rPr>
+                <w:rFonts w:ascii="Tahoma" w:hAnsi="Tahoma" w:cs="Tahoma"/>
+              </w:rPr>
+              <w:t>L’impianto è composto da LED rossi, gialli e verdi per i due incroci veicolari e da LED rosso e verde per il semaforo pedonale. Ogni LED è collegato in serie a una resistenza da 220 Ω. La resistenza serve per limitare la corrente elettrica e proteggere sia il LED sia i pin digitali della scheda Arduino.</w:t>
+            </w:r>
+            <w:r>
+              <w:rPr>
+                <w:rFonts w:ascii="Tahoma" w:hAnsi="Tahoma" w:cs="Tahoma"/>
+              </w:rPr>
+              <w:t xml:space="preserve"> </w:t>
+            </w:r>
+            <w:r>
+              <w:rPr>
+                <w:rFonts w:ascii="Tahoma" w:hAnsi="Tahoma" w:cs="Tahoma"/>
+              </w:rPr>
+              <w:t>Il programma è stato scritto in linguaggio C/C++ nell’ambiente Arduino. Il funzionamento si basa su una sequenza temporale che regola l’accensione dei LED in modo alternato, evitando situazioni di pericolo.</w:t>
+            </w:r>
+            <w:r>
+              <w:rPr>
+                <w:rFonts w:ascii="Tahoma" w:hAnsi="Tahoma" w:cs="Tahoma"/>
+              </w:rPr>
+              <w:t xml:space="preserve"> </w:t>
+            </w:r>
+            <w:r>
+              <w:rPr>
+                <w:rFonts w:ascii="Tahoma" w:hAnsi="Tahoma" w:cs="Tahoma"/>
+              </w:rPr>
+              <w:t>Dal punto di vista teorico, il sistema può essere descritto come una macchina a stati finiti (Finite State Machine). Ogni stato rappresenta una fase precisa del semaforo (verde, giallo o rosso). Il passaggio da uno stato all’altro avviene dopo un intervallo di tempo stabilito dal programma. Questo metodo garantisce che non ci siano conflitti tra i due incroci, cioè che non si accendano due verdi contemporaneamente su strade che si incrociano.</w:t>
+            </w:r>
+            <w:r>
+              <w:rPr>
+                <w:rFonts w:ascii="Tahoma" w:hAnsi="Tahoma" w:cs="Tahoma"/>
+              </w:rPr>
+              <w:t xml:space="preserve"> </w:t>
+            </w:r>
+            <w:r>
+              <w:rPr>
+                <w:rFonts w:ascii="Tahoma" w:hAnsi="Tahoma" w:cs="Tahoma"/>
+              </w:rPr>
+              <w:t>L’impianto viene definito “intelligente” perché il verde pedonale non si attiva in modo automatico e continuo, ma solo quando viene premuto il pulsante. Quando succede, il sistema termina la fase in corso, mette entrambi gli incroci in rosso e attiva il verde pedonale per un tempo definito, garantendo la sicurezza.</w:t>
+            </w:r>
           </w:p>
         </w:tc>
       </w:tr>
@@ -999,6 +1016,18 @@
                 <w:rFonts w:asciiTheme="majorHAnsi" w:hAnsiTheme="majorHAnsi"/>
               </w:rPr>
             </w:pPr>
+            <w:r>
+              <w:rPr>
+                <w:rFonts w:asciiTheme="majorHAnsi" w:hAnsiTheme="majorHAnsi"/>
+              </w:rPr>
+              <w:t xml:space="preserve"> </w:t>
+            </w:r>
+            <w:r>
+              <w:rPr>
+                <w:rFonts w:asciiTheme="majorHAnsi" w:hAnsiTheme="majorHAnsi"/>
+              </w:rPr>
+              <w:br/>
+            </w:r>
           </w:p>
         </w:tc>
       </w:tr>
@@ -1112,6 +1141,791 @@
                 <w:rFonts w:asciiTheme="majorHAnsi" w:hAnsiTheme="majorHAnsi"/>
               </w:rPr>
             </w:pPr>
+            <w:r>
+              <w:rPr>
+                <w:rFonts w:asciiTheme="majorHAnsi" w:hAnsiTheme="majorHAnsi"/>
+              </w:rPr>
+              <w:br/>
+            </w:r>
+          </w:p>
+          <w:tbl>
+            <w:tblPr>
+              <w:tblW w:w="0" w:type="auto"/>
+              <w:tblCellSpacing w:w="15" w:type="dxa"/>
+              <w:tblInd w:w="429" w:type="dxa"/>
+              <w:tblBorders>
+                <w:top w:val="single" w:sz="4" w:space="0" w:color="auto"/>
+                <w:left w:val="single" w:sz="4" w:space="0" w:color="auto"/>
+                <w:bottom w:val="single" w:sz="4" w:space="0" w:color="auto"/>
+                <w:right w:val="single" w:sz="4" w:space="0" w:color="auto"/>
+                <w:insideH w:val="single" w:sz="4" w:space="0" w:color="auto"/>
+                <w:insideV w:val="single" w:sz="4" w:space="0" w:color="auto"/>
+              </w:tblBorders>
+              <w:tblCellMar>
+                <w:top w:w="15" w:type="dxa"/>
+                <w:left w:w="15" w:type="dxa"/>
+                <w:bottom w:w="15" w:type="dxa"/>
+                <w:right w:w="15" w:type="dxa"/>
+              </w:tblCellMar>
+              <w:tblLook w:val="04A0" w:firstRow="1" w:lastRow="0" w:firstColumn="1" w:lastColumn="0" w:noHBand="0" w:noVBand="1"/>
+            </w:tblPr>
+            <w:tblGrid>
+              <w:gridCol w:w="1749"/>
+              <w:gridCol w:w="2287"/>
+              <w:gridCol w:w="1820"/>
+              <w:gridCol w:w="895"/>
+            </w:tblGrid>
+            <w:tr>
+              <w:trPr>
+                <w:tblHeader/>
+                <w:tblCellSpacing w:w="15" w:type="dxa"/>
+              </w:trPr>
+              <w:tc>
+                <w:tcPr>
+                  <w:tcW w:w="0" w:type="auto"/>
+                  <w:vAlign w:val="center"/>
+                  <w:hideMark/>
+                </w:tcPr>
+                <w:p>
+                  <w:pPr>
+                    <w:spacing w:after="0" w:line="240" w:lineRule="auto"/>
+                    <w:jc w:val="center"/>
+                    <w:rPr>
+                      <w:rFonts w:ascii="Times New Roman" w:eastAsia="Times New Roman" w:hAnsi="Times New Roman" w:cs="Times New Roman"/>
+                      <w:b/>
+                      <w:bCs/>
+                      <w:kern w:val="0"/>
+                      <w:lang w:eastAsia="it-IT"/>
+                      <w14:ligatures w14:val="none"/>
+                    </w:rPr>
+                  </w:pPr>
+                  <w:r>
+                    <w:rPr>
+                      <w:rFonts w:ascii="Times New Roman" w:eastAsia="Times New Roman" w:hAnsi="Times New Roman" w:cs="Times New Roman"/>
+                      <w:b/>
+                      <w:bCs/>
+                      <w:kern w:val="0"/>
+                      <w:lang w:eastAsia="it-IT"/>
+                      <w14:ligatures w14:val="none"/>
+                    </w:rPr>
+                    <w:t>Fase del sistema</w:t>
+                  </w:r>
+                </w:p>
+              </w:tc>
+              <w:tc>
+                <w:tcPr>
+                  <w:tcW w:w="0" w:type="auto"/>
+                  <w:vAlign w:val="center"/>
+                  <w:hideMark/>
+                </w:tcPr>
+                <w:p>
+                  <w:pPr>
+                    <w:spacing w:after="0" w:line="240" w:lineRule="auto"/>
+                    <w:jc w:val="center"/>
+                    <w:rPr>
+                      <w:rFonts w:ascii="Times New Roman" w:eastAsia="Times New Roman" w:hAnsi="Times New Roman" w:cs="Times New Roman"/>
+                      <w:b/>
+                      <w:bCs/>
+                      <w:kern w:val="0"/>
+                      <w:lang w:eastAsia="it-IT"/>
+                      <w14:ligatures w14:val="none"/>
+                    </w:rPr>
+                  </w:pPr>
+                  <w:r>
+                    <w:rPr>
+                      <w:rFonts w:ascii="Times New Roman" w:eastAsia="Times New Roman" w:hAnsi="Times New Roman" w:cs="Times New Roman"/>
+                      <w:b/>
+                      <w:bCs/>
+                      <w:kern w:val="0"/>
+                      <w:lang w:eastAsia="it-IT"/>
+                      <w14:ligatures w14:val="none"/>
+                    </w:rPr>
+                    <w:t>Tempo programmato</w:t>
+                  </w:r>
+                </w:p>
+              </w:tc>
+              <w:tc>
+                <w:tcPr>
+                  <w:tcW w:w="0" w:type="auto"/>
+                  <w:vAlign w:val="center"/>
+                  <w:hideMark/>
+                </w:tcPr>
+                <w:p>
+                  <w:pPr>
+                    <w:spacing w:after="0" w:line="240" w:lineRule="auto"/>
+                    <w:jc w:val="center"/>
+                    <w:rPr>
+                      <w:rFonts w:ascii="Times New Roman" w:eastAsia="Times New Roman" w:hAnsi="Times New Roman" w:cs="Times New Roman"/>
+                      <w:b/>
+                      <w:bCs/>
+                      <w:kern w:val="0"/>
+                      <w:lang w:eastAsia="it-IT"/>
+                      <w14:ligatures w14:val="none"/>
+                    </w:rPr>
+                  </w:pPr>
+                  <w:r>
+                    <w:rPr>
+                      <w:rFonts w:ascii="Times New Roman" w:eastAsia="Times New Roman" w:hAnsi="Times New Roman" w:cs="Times New Roman"/>
+                      <w:b/>
+                      <w:bCs/>
+                      <w:kern w:val="0"/>
+                      <w:lang w:eastAsia="it-IT"/>
+                      <w14:ligatures w14:val="none"/>
+                    </w:rPr>
+                    <w:t>Tempo osservato</w:t>
+                  </w:r>
+                </w:p>
+              </w:tc>
+              <w:tc>
+                <w:tcPr>
+                  <w:tcW w:w="0" w:type="auto"/>
+                  <w:vAlign w:val="center"/>
+                  <w:hideMark/>
+                </w:tcPr>
+                <w:p>
+                  <w:pPr>
+                    <w:spacing w:after="0" w:line="240" w:lineRule="auto"/>
+                    <w:jc w:val="center"/>
+                    <w:rPr>
+                      <w:rFonts w:ascii="Times New Roman" w:eastAsia="Times New Roman" w:hAnsi="Times New Roman" w:cs="Times New Roman"/>
+                      <w:b/>
+                      <w:bCs/>
+                      <w:kern w:val="0"/>
+                      <w:lang w:eastAsia="it-IT"/>
+                      <w14:ligatures w14:val="none"/>
+                    </w:rPr>
+                  </w:pPr>
+                  <w:r>
+                    <w:rPr>
+                      <w:rFonts w:ascii="Times New Roman" w:eastAsia="Times New Roman" w:hAnsi="Times New Roman" w:cs="Times New Roman"/>
+                      <w:b/>
+                      <w:bCs/>
+                      <w:kern w:val="0"/>
+                      <w:lang w:eastAsia="it-IT"/>
+                      <w14:ligatures w14:val="none"/>
+                    </w:rPr>
+                    <w:t>Esito</w:t>
+                  </w:r>
+                </w:p>
+              </w:tc>
+            </w:tr>
+            <w:tr>
+              <w:trPr>
+                <w:tblCellSpacing w:w="15" w:type="dxa"/>
+              </w:trPr>
+              <w:tc>
+                <w:tcPr>
+                  <w:tcW w:w="0" w:type="auto"/>
+                  <w:vAlign w:val="center"/>
+                  <w:hideMark/>
+                </w:tcPr>
+                <w:p>
+                  <w:pPr>
+                    <w:spacing w:after="0" w:line="240" w:lineRule="auto"/>
+                    <w:rPr>
+                      <w:rFonts w:ascii="Times New Roman" w:eastAsia="Times New Roman" w:hAnsi="Times New Roman" w:cs="Times New Roman"/>
+                      <w:kern w:val="0"/>
+                      <w:lang w:eastAsia="it-IT"/>
+                      <w14:ligatures w14:val="none"/>
+                    </w:rPr>
+                  </w:pPr>
+                  <w:r>
+                    <w:rPr>
+                      <w:rFonts w:ascii="Times New Roman" w:eastAsia="Times New Roman" w:hAnsi="Times New Roman" w:cs="Times New Roman"/>
+                      <w:kern w:val="0"/>
+                      <w:lang w:eastAsia="it-IT"/>
+                      <w14:ligatures w14:val="none"/>
+                    </w:rPr>
+                    <w:t>Verde incrocio 1</w:t>
+                  </w:r>
+                </w:p>
+              </w:tc>
+              <w:tc>
+                <w:tcPr>
+                  <w:tcW w:w="0" w:type="auto"/>
+                  <w:vAlign w:val="center"/>
+                  <w:hideMark/>
+                </w:tcPr>
+                <w:p>
+                  <w:pPr>
+                    <w:spacing w:after="0" w:line="240" w:lineRule="auto"/>
+                    <w:rPr>
+                      <w:rFonts w:ascii="Times New Roman" w:eastAsia="Times New Roman" w:hAnsi="Times New Roman" w:cs="Times New Roman"/>
+                      <w:kern w:val="0"/>
+                      <w:lang w:eastAsia="it-IT"/>
+                      <w14:ligatures w14:val="none"/>
+                    </w:rPr>
+                  </w:pPr>
+                  <w:r>
+                    <w:rPr>
+                      <w:rFonts w:ascii="Times New Roman" w:eastAsia="Times New Roman" w:hAnsi="Times New Roman" w:cs="Times New Roman"/>
+                      <w:kern w:val="0"/>
+                      <w:lang w:eastAsia="it-IT"/>
+                      <w14:ligatures w14:val="none"/>
+                    </w:rPr>
+                    <w:t>5 s</w:t>
+                  </w:r>
+                </w:p>
+              </w:tc>
+              <w:tc>
+                <w:tcPr>
+                  <w:tcW w:w="0" w:type="auto"/>
+                  <w:vAlign w:val="center"/>
+                  <w:hideMark/>
+                </w:tcPr>
+                <w:p>
+                  <w:pPr>
+                    <w:spacing w:after="0" w:line="240" w:lineRule="auto"/>
+                    <w:rPr>
+                      <w:rFonts w:ascii="Times New Roman" w:eastAsia="Times New Roman" w:hAnsi="Times New Roman" w:cs="Times New Roman"/>
+                      <w:kern w:val="0"/>
+                      <w:lang w:eastAsia="it-IT"/>
+                      <w14:ligatures w14:val="none"/>
+                    </w:rPr>
+                  </w:pPr>
+                  <w:r>
+                    <w:rPr>
+                      <w:rFonts w:ascii="Times New Roman" w:eastAsia="Times New Roman" w:hAnsi="Times New Roman" w:cs="Times New Roman"/>
+                      <w:kern w:val="0"/>
+                      <w:lang w:eastAsia="it-IT"/>
+                      <w14:ligatures w14:val="none"/>
+                    </w:rPr>
+                    <w:t>5 s</w:t>
+                  </w:r>
+                </w:p>
+              </w:tc>
+              <w:tc>
+                <w:tcPr>
+                  <w:tcW w:w="0" w:type="auto"/>
+                  <w:vAlign w:val="center"/>
+                  <w:hideMark/>
+                </w:tcPr>
+                <w:p>
+                  <w:pPr>
+                    <w:spacing w:after="0" w:line="240" w:lineRule="auto"/>
+                    <w:rPr>
+                      <w:rFonts w:ascii="Times New Roman" w:eastAsia="Times New Roman" w:hAnsi="Times New Roman" w:cs="Times New Roman"/>
+                      <w:kern w:val="0"/>
+                      <w:lang w:eastAsia="it-IT"/>
+                      <w14:ligatures w14:val="none"/>
+                    </w:rPr>
+                  </w:pPr>
+                  <w:r>
+                    <w:rPr>
+                      <w:rFonts w:ascii="Times New Roman" w:eastAsia="Times New Roman" w:hAnsi="Times New Roman" w:cs="Times New Roman"/>
+                      <w:kern w:val="0"/>
+                      <w:lang w:eastAsia="it-IT"/>
+                      <w14:ligatures w14:val="none"/>
+                    </w:rPr>
+                    <w:t>Corretto</w:t>
+                  </w:r>
+                </w:p>
+              </w:tc>
+            </w:tr>
+            <w:tr>
+              <w:trPr>
+                <w:tblCellSpacing w:w="15" w:type="dxa"/>
+              </w:trPr>
+              <w:tc>
+                <w:tcPr>
+                  <w:tcW w:w="0" w:type="auto"/>
+                  <w:vAlign w:val="center"/>
+                  <w:hideMark/>
+                </w:tcPr>
+                <w:p>
+                  <w:pPr>
+                    <w:spacing w:after="0" w:line="240" w:lineRule="auto"/>
+                    <w:rPr>
+                      <w:rFonts w:ascii="Times New Roman" w:eastAsia="Times New Roman" w:hAnsi="Times New Roman" w:cs="Times New Roman"/>
+                      <w:kern w:val="0"/>
+                      <w:lang w:eastAsia="it-IT"/>
+                      <w14:ligatures w14:val="none"/>
+                    </w:rPr>
+                  </w:pPr>
+                  <w:r>
+                    <w:rPr>
+                      <w:rFonts w:ascii="Times New Roman" w:eastAsia="Times New Roman" w:hAnsi="Times New Roman" w:cs="Times New Roman"/>
+                      <w:kern w:val="0"/>
+                      <w:lang w:eastAsia="it-IT"/>
+                      <w14:ligatures w14:val="none"/>
+                    </w:rPr>
+                    <w:t>Giallo incrocio 1</w:t>
+                  </w:r>
+                </w:p>
+              </w:tc>
+              <w:tc>
+                <w:tcPr>
+                  <w:tcW w:w="0" w:type="auto"/>
+                  <w:vAlign w:val="center"/>
+                  <w:hideMark/>
+                </w:tcPr>
+                <w:p>
+                  <w:pPr>
+                    <w:spacing w:after="0" w:line="240" w:lineRule="auto"/>
+                    <w:rPr>
+                      <w:rFonts w:ascii="Times New Roman" w:eastAsia="Times New Roman" w:hAnsi="Times New Roman" w:cs="Times New Roman"/>
+                      <w:kern w:val="0"/>
+                      <w:lang w:eastAsia="it-IT"/>
+                      <w14:ligatures w14:val="none"/>
+                    </w:rPr>
+                  </w:pPr>
+                  <w:r>
+                    <w:rPr>
+                      <w:rFonts w:ascii="Times New Roman" w:eastAsia="Times New Roman" w:hAnsi="Times New Roman" w:cs="Times New Roman"/>
+                      <w:kern w:val="0"/>
+                      <w:lang w:eastAsia="it-IT"/>
+                      <w14:ligatures w14:val="none"/>
+                    </w:rPr>
+                    <w:t>2 s</w:t>
+                  </w:r>
+                </w:p>
+              </w:tc>
+              <w:tc>
+                <w:tcPr>
+                  <w:tcW w:w="0" w:type="auto"/>
+                  <w:vAlign w:val="center"/>
+                  <w:hideMark/>
+                </w:tcPr>
+                <w:p>
+                  <w:pPr>
+                    <w:spacing w:after="0" w:line="240" w:lineRule="auto"/>
+                    <w:rPr>
+                      <w:rFonts w:ascii="Times New Roman" w:eastAsia="Times New Roman" w:hAnsi="Times New Roman" w:cs="Times New Roman"/>
+                      <w:kern w:val="0"/>
+                      <w:lang w:eastAsia="it-IT"/>
+                      <w14:ligatures w14:val="none"/>
+                    </w:rPr>
+                  </w:pPr>
+                  <w:r>
+                    <w:rPr>
+                      <w:rFonts w:ascii="Times New Roman" w:eastAsia="Times New Roman" w:hAnsi="Times New Roman" w:cs="Times New Roman"/>
+                      <w:kern w:val="0"/>
+                      <w:lang w:eastAsia="it-IT"/>
+                      <w14:ligatures w14:val="none"/>
+                    </w:rPr>
+                    <w:t>2 s</w:t>
+                  </w:r>
+                </w:p>
+              </w:tc>
+              <w:tc>
+                <w:tcPr>
+                  <w:tcW w:w="0" w:type="auto"/>
+                  <w:vAlign w:val="center"/>
+                  <w:hideMark/>
+                </w:tcPr>
+                <w:p>
+                  <w:pPr>
+                    <w:spacing w:after="0" w:line="240" w:lineRule="auto"/>
+                    <w:rPr>
+                      <w:rFonts w:ascii="Times New Roman" w:eastAsia="Times New Roman" w:hAnsi="Times New Roman" w:cs="Times New Roman"/>
+                      <w:kern w:val="0"/>
+                      <w:lang w:eastAsia="it-IT"/>
+                      <w14:ligatures w14:val="none"/>
+                    </w:rPr>
+                  </w:pPr>
+                  <w:r>
+                    <w:rPr>
+                      <w:rFonts w:ascii="Times New Roman" w:eastAsia="Times New Roman" w:hAnsi="Times New Roman" w:cs="Times New Roman"/>
+                      <w:kern w:val="0"/>
+                      <w:lang w:eastAsia="it-IT"/>
+                      <w14:ligatures w14:val="none"/>
+                    </w:rPr>
+                    <w:t>Corretto</w:t>
+                  </w:r>
+                </w:p>
+              </w:tc>
+            </w:tr>
+            <w:tr>
+              <w:trPr>
+                <w:tblCellSpacing w:w="15" w:type="dxa"/>
+              </w:trPr>
+              <w:tc>
+                <w:tcPr>
+                  <w:tcW w:w="0" w:type="auto"/>
+                  <w:vAlign w:val="center"/>
+                  <w:hideMark/>
+                </w:tcPr>
+                <w:p>
+                  <w:pPr>
+                    <w:spacing w:after="0" w:line="240" w:lineRule="auto"/>
+                    <w:rPr>
+                      <w:rFonts w:ascii="Times New Roman" w:eastAsia="Times New Roman" w:hAnsi="Times New Roman" w:cs="Times New Roman"/>
+                      <w:kern w:val="0"/>
+                      <w:lang w:eastAsia="it-IT"/>
+                      <w14:ligatures w14:val="none"/>
+                    </w:rPr>
+                  </w:pPr>
+                  <w:r>
+                    <w:rPr>
+                      <w:rFonts w:ascii="Times New Roman" w:eastAsia="Times New Roman" w:hAnsi="Times New Roman" w:cs="Times New Roman"/>
+                      <w:kern w:val="0"/>
+                      <w:lang w:eastAsia="it-IT"/>
+                      <w14:ligatures w14:val="none"/>
+                    </w:rPr>
+                    <w:t>Verde incrocio 2</w:t>
+                  </w:r>
+                </w:p>
+              </w:tc>
+              <w:tc>
+                <w:tcPr>
+                  <w:tcW w:w="0" w:type="auto"/>
+                  <w:vAlign w:val="center"/>
+                  <w:hideMark/>
+                </w:tcPr>
+                <w:p>
+                  <w:pPr>
+                    <w:spacing w:after="0" w:line="240" w:lineRule="auto"/>
+                    <w:rPr>
+                      <w:rFonts w:ascii="Times New Roman" w:eastAsia="Times New Roman" w:hAnsi="Times New Roman" w:cs="Times New Roman"/>
+                      <w:kern w:val="0"/>
+                      <w:lang w:eastAsia="it-IT"/>
+                      <w14:ligatures w14:val="none"/>
+                    </w:rPr>
+                  </w:pPr>
+                  <w:r>
+                    <w:rPr>
+                      <w:rFonts w:ascii="Times New Roman" w:eastAsia="Times New Roman" w:hAnsi="Times New Roman" w:cs="Times New Roman"/>
+                      <w:kern w:val="0"/>
+                      <w:lang w:eastAsia="it-IT"/>
+                      <w14:ligatures w14:val="none"/>
+                    </w:rPr>
+                    <w:t>5 s</w:t>
+                  </w:r>
+                </w:p>
+              </w:tc>
+              <w:tc>
+                <w:tcPr>
+                  <w:tcW w:w="0" w:type="auto"/>
+                  <w:vAlign w:val="center"/>
+                  <w:hideMark/>
+                </w:tcPr>
+                <w:p>
+                  <w:pPr>
+                    <w:spacing w:after="0" w:line="240" w:lineRule="auto"/>
+                    <w:rPr>
+                      <w:rFonts w:ascii="Times New Roman" w:eastAsia="Times New Roman" w:hAnsi="Times New Roman" w:cs="Times New Roman"/>
+                      <w:kern w:val="0"/>
+                      <w:lang w:eastAsia="it-IT"/>
+                      <w14:ligatures w14:val="none"/>
+                    </w:rPr>
+                  </w:pPr>
+                  <w:r>
+                    <w:rPr>
+                      <w:rFonts w:ascii="Times New Roman" w:eastAsia="Times New Roman" w:hAnsi="Times New Roman" w:cs="Times New Roman"/>
+                      <w:kern w:val="0"/>
+                      <w:lang w:eastAsia="it-IT"/>
+                      <w14:ligatures w14:val="none"/>
+                    </w:rPr>
+                    <w:t>5 s</w:t>
+                  </w:r>
+                </w:p>
+              </w:tc>
+              <w:tc>
+                <w:tcPr>
+                  <w:tcW w:w="0" w:type="auto"/>
+                  <w:vAlign w:val="center"/>
+                  <w:hideMark/>
+                </w:tcPr>
+                <w:p>
+                  <w:pPr>
+                    <w:spacing w:after="0" w:line="240" w:lineRule="auto"/>
+                    <w:rPr>
+                      <w:rFonts w:ascii="Times New Roman" w:eastAsia="Times New Roman" w:hAnsi="Times New Roman" w:cs="Times New Roman"/>
+                      <w:kern w:val="0"/>
+                      <w:lang w:eastAsia="it-IT"/>
+                      <w14:ligatures w14:val="none"/>
+                    </w:rPr>
+                  </w:pPr>
+                  <w:r>
+                    <w:rPr>
+                      <w:rFonts w:ascii="Times New Roman" w:eastAsia="Times New Roman" w:hAnsi="Times New Roman" w:cs="Times New Roman"/>
+                      <w:kern w:val="0"/>
+                      <w:lang w:eastAsia="it-IT"/>
+                      <w14:ligatures w14:val="none"/>
+                    </w:rPr>
+                    <w:t>Corretto</w:t>
+                  </w:r>
+                </w:p>
+              </w:tc>
+            </w:tr>
+            <w:tr>
+              <w:trPr>
+                <w:tblCellSpacing w:w="15" w:type="dxa"/>
+              </w:trPr>
+              <w:tc>
+                <w:tcPr>
+                  <w:tcW w:w="0" w:type="auto"/>
+                  <w:vAlign w:val="center"/>
+                  <w:hideMark/>
+                </w:tcPr>
+                <w:p>
+                  <w:pPr>
+                    <w:spacing w:after="0" w:line="240" w:lineRule="auto"/>
+                    <w:rPr>
+                      <w:rFonts w:ascii="Times New Roman" w:eastAsia="Times New Roman" w:hAnsi="Times New Roman" w:cs="Times New Roman"/>
+                      <w:kern w:val="0"/>
+                      <w:lang w:eastAsia="it-IT"/>
+                      <w14:ligatures w14:val="none"/>
+                    </w:rPr>
+                  </w:pPr>
+                  <w:r>
+                    <w:rPr>
+                      <w:rFonts w:ascii="Times New Roman" w:eastAsia="Times New Roman" w:hAnsi="Times New Roman" w:cs="Times New Roman"/>
+                      <w:kern w:val="0"/>
+                      <w:lang w:eastAsia="it-IT"/>
+                      <w14:ligatures w14:val="none"/>
+                    </w:rPr>
+                    <w:t>Giallo incrocio 2</w:t>
+                  </w:r>
+                </w:p>
+              </w:tc>
+              <w:tc>
+                <w:tcPr>
+                  <w:tcW w:w="0" w:type="auto"/>
+                  <w:vAlign w:val="center"/>
+                  <w:hideMark/>
+                </w:tcPr>
+                <w:p>
+                  <w:pPr>
+                    <w:spacing w:after="0" w:line="240" w:lineRule="auto"/>
+                    <w:rPr>
+                      <w:rFonts w:ascii="Times New Roman" w:eastAsia="Times New Roman" w:hAnsi="Times New Roman" w:cs="Times New Roman"/>
+                      <w:kern w:val="0"/>
+                      <w:lang w:eastAsia="it-IT"/>
+                      <w14:ligatures w14:val="none"/>
+                    </w:rPr>
+                  </w:pPr>
+                  <w:r>
+                    <w:rPr>
+                      <w:rFonts w:ascii="Times New Roman" w:eastAsia="Times New Roman" w:hAnsi="Times New Roman" w:cs="Times New Roman"/>
+                      <w:kern w:val="0"/>
+                      <w:lang w:eastAsia="it-IT"/>
+                      <w14:ligatures w14:val="none"/>
+                    </w:rPr>
+                    <w:t>2 s</w:t>
+                  </w:r>
+                </w:p>
+              </w:tc>
+              <w:tc>
+                <w:tcPr>
+                  <w:tcW w:w="0" w:type="auto"/>
+                  <w:vAlign w:val="center"/>
+                  <w:hideMark/>
+                </w:tcPr>
+                <w:p>
+                  <w:pPr>
+                    <w:spacing w:after="0" w:line="240" w:lineRule="auto"/>
+                    <w:rPr>
+                      <w:rFonts w:ascii="Times New Roman" w:eastAsia="Times New Roman" w:hAnsi="Times New Roman" w:cs="Times New Roman"/>
+                      <w:kern w:val="0"/>
+                      <w:lang w:eastAsia="it-IT"/>
+                      <w14:ligatures w14:val="none"/>
+                    </w:rPr>
+                  </w:pPr>
+                  <w:r>
+                    <w:rPr>
+                      <w:rFonts w:ascii="Times New Roman" w:eastAsia="Times New Roman" w:hAnsi="Times New Roman" w:cs="Times New Roman"/>
+                      <w:kern w:val="0"/>
+                      <w:lang w:eastAsia="it-IT"/>
+                      <w14:ligatures w14:val="none"/>
+                    </w:rPr>
+                    <w:t>2 s</w:t>
+                  </w:r>
+                </w:p>
+              </w:tc>
+              <w:tc>
+                <w:tcPr>
+                  <w:tcW w:w="0" w:type="auto"/>
+                  <w:vAlign w:val="center"/>
+                  <w:hideMark/>
+                </w:tcPr>
+                <w:p>
+                  <w:pPr>
+                    <w:spacing w:after="0" w:line="240" w:lineRule="auto"/>
+                    <w:rPr>
+                      <w:rFonts w:ascii="Times New Roman" w:eastAsia="Times New Roman" w:hAnsi="Times New Roman" w:cs="Times New Roman"/>
+                      <w:kern w:val="0"/>
+                      <w:lang w:eastAsia="it-IT"/>
+                      <w14:ligatures w14:val="none"/>
+                    </w:rPr>
+                  </w:pPr>
+                  <w:r>
+                    <w:rPr>
+                      <w:rFonts w:ascii="Times New Roman" w:eastAsia="Times New Roman" w:hAnsi="Times New Roman" w:cs="Times New Roman"/>
+                      <w:kern w:val="0"/>
+                      <w:lang w:eastAsia="it-IT"/>
+                      <w14:ligatures w14:val="none"/>
+                    </w:rPr>
+                    <w:t>Corretto</w:t>
+                  </w:r>
+                </w:p>
+              </w:tc>
+            </w:tr>
+            <w:tr>
+              <w:trPr>
+                <w:tblCellSpacing w:w="15" w:type="dxa"/>
+              </w:trPr>
+              <w:tc>
+                <w:tcPr>
+                  <w:tcW w:w="0" w:type="auto"/>
+                  <w:vAlign w:val="center"/>
+                  <w:hideMark/>
+                </w:tcPr>
+                <w:p>
+                  <w:pPr>
+                    <w:spacing w:after="0" w:line="240" w:lineRule="auto"/>
+                    <w:rPr>
+                      <w:rFonts w:ascii="Times New Roman" w:eastAsia="Times New Roman" w:hAnsi="Times New Roman" w:cs="Times New Roman"/>
+                      <w:kern w:val="0"/>
+                      <w:lang w:eastAsia="it-IT"/>
+                      <w14:ligatures w14:val="none"/>
+                    </w:rPr>
+                  </w:pPr>
+                  <w:r>
+                    <w:rPr>
+                      <w:rFonts w:ascii="Times New Roman" w:eastAsia="Times New Roman" w:hAnsi="Times New Roman" w:cs="Times New Roman"/>
+                      <w:kern w:val="0"/>
+                      <w:lang w:eastAsia="it-IT"/>
+                      <w14:ligatures w14:val="none"/>
+                    </w:rPr>
+                    <w:t>Verde pedonale</w:t>
+                  </w:r>
+                </w:p>
+              </w:tc>
+              <w:tc>
+                <w:tcPr>
+                  <w:tcW w:w="0" w:type="auto"/>
+                  <w:vAlign w:val="center"/>
+                  <w:hideMark/>
+                </w:tcPr>
+                <w:p>
+                  <w:pPr>
+                    <w:spacing w:after="0" w:line="240" w:lineRule="auto"/>
+                    <w:rPr>
+                      <w:rFonts w:ascii="Times New Roman" w:eastAsia="Times New Roman" w:hAnsi="Times New Roman" w:cs="Times New Roman"/>
+                      <w:kern w:val="0"/>
+                      <w:lang w:eastAsia="it-IT"/>
+                      <w14:ligatures w14:val="none"/>
+                    </w:rPr>
+                  </w:pPr>
+                  <w:r>
+                    <w:rPr>
+                      <w:rFonts w:ascii="Times New Roman" w:eastAsia="Times New Roman" w:hAnsi="Times New Roman" w:cs="Times New Roman"/>
+                      <w:kern w:val="0"/>
+                      <w:lang w:eastAsia="it-IT"/>
+                      <w14:ligatures w14:val="none"/>
+                    </w:rPr>
+                    <w:t>5 s</w:t>
+                  </w:r>
+                </w:p>
+              </w:tc>
+              <w:tc>
+                <w:tcPr>
+                  <w:tcW w:w="0" w:type="auto"/>
+                  <w:vAlign w:val="center"/>
+                  <w:hideMark/>
+                </w:tcPr>
+                <w:p>
+                  <w:pPr>
+                    <w:spacing w:after="0" w:line="240" w:lineRule="auto"/>
+                    <w:rPr>
+                      <w:rFonts w:ascii="Times New Roman" w:eastAsia="Times New Roman" w:hAnsi="Times New Roman" w:cs="Times New Roman"/>
+                      <w:kern w:val="0"/>
+                      <w:lang w:eastAsia="it-IT"/>
+                      <w14:ligatures w14:val="none"/>
+                    </w:rPr>
+                  </w:pPr>
+                  <w:r>
+                    <w:rPr>
+                      <w:rFonts w:ascii="Times New Roman" w:eastAsia="Times New Roman" w:hAnsi="Times New Roman" w:cs="Times New Roman"/>
+                      <w:kern w:val="0"/>
+                      <w:lang w:eastAsia="it-IT"/>
+                      <w14:ligatures w14:val="none"/>
+                    </w:rPr>
+                    <w:t>5 s</w:t>
+                  </w:r>
+                </w:p>
+              </w:tc>
+              <w:tc>
+                <w:tcPr>
+                  <w:tcW w:w="0" w:type="auto"/>
+                  <w:vAlign w:val="center"/>
+                  <w:hideMark/>
+                </w:tcPr>
+                <w:p>
+                  <w:pPr>
+                    <w:spacing w:after="0" w:line="240" w:lineRule="auto"/>
+                    <w:rPr>
+                      <w:rFonts w:ascii="Times New Roman" w:eastAsia="Times New Roman" w:hAnsi="Times New Roman" w:cs="Times New Roman"/>
+                      <w:kern w:val="0"/>
+                      <w:lang w:eastAsia="it-IT"/>
+                      <w14:ligatures w14:val="none"/>
+                    </w:rPr>
+                  </w:pPr>
+                  <w:r>
+                    <w:rPr>
+                      <w:rFonts w:ascii="Times New Roman" w:eastAsia="Times New Roman" w:hAnsi="Times New Roman" w:cs="Times New Roman"/>
+                      <w:kern w:val="0"/>
+                      <w:lang w:eastAsia="it-IT"/>
+                      <w14:ligatures w14:val="none"/>
+                    </w:rPr>
+                    <w:t>Corretto</w:t>
+                  </w:r>
+                </w:p>
+              </w:tc>
+            </w:tr>
+          </w:tbl>
+          <w:p>
+            <w:pPr>
+              <w:rPr>
+                <w:rFonts w:asciiTheme="majorHAnsi" w:hAnsiTheme="majorHAnsi"/>
+                <w:b/>
+                <w:bCs/>
+              </w:rPr>
+            </w:pPr>
+            <w:r>
+              <w:rPr>
+                <w:rFonts w:asciiTheme="majorHAnsi" w:hAnsiTheme="majorHAnsi"/>
+              </w:rPr>
+              <w:br/>
+              <w:t xml:space="preserve">      </w:t>
+            </w:r>
+            <w:r>
+              <w:rPr>
+                <w:rFonts w:asciiTheme="majorHAnsi" w:hAnsiTheme="majorHAnsi"/>
+              </w:rPr>
+              <w:br/>
+            </w:r>
+            <w:r>
+              <w:rPr>
+                <w:rFonts w:asciiTheme="majorHAnsi" w:hAnsiTheme="majorHAnsi"/>
+              </w:rPr>
+              <w:br/>
+              <w:t xml:space="preserve">     </w:t>
+            </w:r>
+            <w:r>
+              <w:rPr>
+                <w:rFonts w:asciiTheme="majorHAnsi" w:hAnsiTheme="majorHAnsi"/>
+              </w:rPr>
+              <w:t xml:space="preserve"> </w:t>
+            </w:r>
+            <w:r>
+              <w:rPr>
+                <w:rFonts w:asciiTheme="majorHAnsi" w:hAnsiTheme="majorHAnsi"/>
+              </w:rPr>
+              <w:t xml:space="preserve">Per vedere il progetto con il codice cliccare qui: </w:t>
+            </w:r>
+            <w:hyperlink r:id="rId9" w:history="1">
+              <w:r>
+                <w:rPr>
+                  <w:rStyle w:val="Collegamentoipertestuale"/>
+                  <w:rFonts w:asciiTheme="majorHAnsi" w:hAnsiTheme="majorHAnsi"/>
+                  <w:b/>
+                  <w:bCs/>
+                </w:rPr>
+                <w:t>CODICE</w:t>
+              </w:r>
+            </w:hyperlink>
           </w:p>
         </w:tc>
       </w:tr>
@@ -1183,8 +1997,297 @@
               <w:ind w:left="273"/>
               <w:rPr>
                 <w:rFonts w:asciiTheme="majorHAnsi" w:hAnsiTheme="majorHAnsi"/>
+                <w:noProof/>
               </w:rPr>
             </w:pPr>
+            <w:r>
+              <w:rPr>
+                <w:rFonts w:asciiTheme="majorHAnsi" w:hAnsiTheme="majorHAnsi"/>
+              </w:rPr>
+              <w:br/>
+            </w:r>
+            <w:r>
+              <w:rPr>
+                <w:rFonts w:asciiTheme="majorHAnsi" w:hAnsiTheme="majorHAnsi"/>
+                <w:noProof/>
+              </w:rPr>
+              <w:drawing>
+                <wp:inline distT="0" distB="0" distL="0" distR="0" wp14:anchorId="2AE115B1" wp14:editId="0ADE9035">
+                  <wp:extent cx="5303520" cy="3021679"/>
+                  <wp:effectExtent l="0" t="0" r="0" b="7620"/>
+                  <wp:docPr id="625957279" name="Immagine 6"/>
+                  <wp:cNvGraphicFramePr>
+                    <a:graphicFrameLocks xmlns:a="http://schemas.openxmlformats.org/drawingml/2006/main" noChangeAspect="1"/>
+                  </wp:cNvGraphicFramePr>
+                  <a:graphic xmlns:a="http://schemas.openxmlformats.org/drawingml/2006/main">
+                    <a:graphicData uri="http://schemas.openxmlformats.org/drawingml/2006/picture">
+                      <pic:pic xmlns:pic="http://schemas.openxmlformats.org/drawingml/2006/picture">
+                        <pic:nvPicPr>
+                          <pic:cNvPr id="625957279" name="Immagine 625957279"/>
+                          <pic:cNvPicPr/>
+                        </pic:nvPicPr>
+                        <pic:blipFill>
+                          <a:blip r:embed="rId10" cstate="print">
+                            <a:extLst>
+                              <a:ext uri="{28A0092B-C50C-407E-A947-70E740481C1C}">
+                                <a14:useLocalDpi xmlns:a14="http://schemas.microsoft.com/office/drawing/2010/main" val="0"/>
+                              </a:ext>
+                            </a:extLst>
+                          </a:blip>
+                          <a:stretch>
+                            <a:fillRect/>
+                          </a:stretch>
+                        </pic:blipFill>
+                        <pic:spPr>
+                          <a:xfrm>
+                            <a:off x="0" y="0"/>
+                            <a:ext cx="5346080" cy="3045928"/>
+                          </a:xfrm>
+                          <a:prstGeom prst="rect">
+                            <a:avLst/>
+                          </a:prstGeom>
+                        </pic:spPr>
+                      </pic:pic>
+                    </a:graphicData>
+                  </a:graphic>
+                </wp:inline>
+              </w:drawing>
+            </w:r>
+          </w:p>
+          <w:p>
+            <w:pPr>
+              <w:ind w:left="273"/>
+              <w:rPr>
+                <w:rFonts w:asciiTheme="majorHAnsi" w:hAnsiTheme="majorHAnsi"/>
+                <w:noProof/>
+              </w:rPr>
+            </w:pPr>
+            <w:r>
+              <w:rPr>
+                <w:rFonts w:asciiTheme="majorHAnsi" w:hAnsiTheme="majorHAnsi"/>
+                <w:noProof/>
+              </w:rPr>
+              <w:br/>
+            </w:r>
+            <w:r>
+              <w:rPr>
+                <w:rFonts w:asciiTheme="majorHAnsi" w:hAnsiTheme="majorHAnsi"/>
+                <w:noProof/>
+              </w:rPr>
+              <w:t>Assegnazione pin:</w:t>
+            </w:r>
+          </w:p>
+          <w:p>
+            <w:pPr>
+              <w:pStyle w:val="Paragrafoelenco"/>
+              <w:numPr>
+                <w:ilvl w:val="0"/>
+                <w:numId w:val="2"/>
+              </w:numPr>
+              <w:tabs>
+                <w:tab w:val="left" w:pos="2916"/>
+              </w:tabs>
+              <w:rPr>
+                <w:rFonts w:asciiTheme="majorHAnsi" w:hAnsiTheme="majorHAnsi"/>
+              </w:rPr>
+            </w:pPr>
+            <w:r>
+              <w:rPr>
+                <w:rFonts w:asciiTheme="majorHAnsi" w:hAnsiTheme="majorHAnsi"/>
+                <w:b/>
+                <w:bCs/>
+              </w:rPr>
+              <w:t>Semaforo 1:</w:t>
+            </w:r>
+            <w:r>
+              <w:rPr>
+                <w:rFonts w:asciiTheme="majorHAnsi" w:hAnsiTheme="majorHAnsi"/>
+              </w:rPr>
+              <w:t xml:space="preserve"> Rosso</w:t>
+            </w:r>
+            <w:r>
+              <w:rPr>
+                <w:rFonts w:ascii="Arial" w:hAnsi="Arial" w:cs="Arial"/>
+              </w:rPr>
+              <w:t> </w:t>
+            </w:r>
+            <w:r>
+              <w:rPr>
+                <w:rFonts w:asciiTheme="majorHAnsi" w:hAnsiTheme="majorHAnsi"/>
+              </w:rPr>
+              <w:t>10, Giallo</w:t>
+            </w:r>
+            <w:r>
+              <w:rPr>
+                <w:rFonts w:ascii="Arial" w:hAnsi="Arial" w:cs="Arial"/>
+              </w:rPr>
+              <w:t> </w:t>
+            </w:r>
+            <w:r>
+              <w:rPr>
+                <w:rFonts w:asciiTheme="majorHAnsi" w:hAnsiTheme="majorHAnsi"/>
+              </w:rPr>
+              <w:t>9, Verde</w:t>
+            </w:r>
+            <w:r>
+              <w:rPr>
+                <w:rFonts w:ascii="Arial" w:hAnsi="Arial" w:cs="Arial"/>
+              </w:rPr>
+              <w:t> </w:t>
+            </w:r>
+            <w:r>
+              <w:rPr>
+                <w:rFonts w:asciiTheme="majorHAnsi" w:hAnsiTheme="majorHAnsi"/>
+              </w:rPr>
+              <w:t>8</w:t>
+            </w:r>
+          </w:p>
+          <w:p>
+            <w:pPr>
+              <w:pStyle w:val="Paragrafoelenco"/>
+              <w:numPr>
+                <w:ilvl w:val="0"/>
+                <w:numId w:val="2"/>
+              </w:numPr>
+              <w:tabs>
+                <w:tab w:val="left" w:pos="2916"/>
+              </w:tabs>
+              <w:rPr>
+                <w:rFonts w:asciiTheme="majorHAnsi" w:hAnsiTheme="majorHAnsi"/>
+              </w:rPr>
+            </w:pPr>
+            <w:r>
+              <w:rPr>
+                <w:rFonts w:asciiTheme="majorHAnsi" w:hAnsiTheme="majorHAnsi"/>
+                <w:b/>
+                <w:bCs/>
+              </w:rPr>
+              <w:t>Semaforo 2:</w:t>
+            </w:r>
+            <w:r>
+              <w:rPr>
+                <w:rFonts w:asciiTheme="majorHAnsi" w:hAnsiTheme="majorHAnsi"/>
+              </w:rPr>
+              <w:t xml:space="preserve"> Rosso</w:t>
+            </w:r>
+            <w:r>
+              <w:rPr>
+                <w:rFonts w:ascii="Arial" w:hAnsi="Arial" w:cs="Arial"/>
+              </w:rPr>
+              <w:t> </w:t>
+            </w:r>
+            <w:r>
+              <w:rPr>
+                <w:rFonts w:asciiTheme="majorHAnsi" w:hAnsiTheme="majorHAnsi"/>
+              </w:rPr>
+              <w:t>4, Giallo</w:t>
+            </w:r>
+            <w:r>
+              <w:rPr>
+                <w:rFonts w:ascii="Arial" w:hAnsi="Arial" w:cs="Arial"/>
+              </w:rPr>
+              <w:t> </w:t>
+            </w:r>
+            <w:r>
+              <w:rPr>
+                <w:rFonts w:asciiTheme="majorHAnsi" w:hAnsiTheme="majorHAnsi"/>
+              </w:rPr>
+              <w:t>3, Verde</w:t>
+            </w:r>
+            <w:r>
+              <w:rPr>
+                <w:rFonts w:ascii="Arial" w:hAnsi="Arial" w:cs="Arial"/>
+              </w:rPr>
+              <w:t> </w:t>
+            </w:r>
+            <w:r>
+              <w:rPr>
+                <w:rFonts w:asciiTheme="majorHAnsi" w:hAnsiTheme="majorHAnsi"/>
+              </w:rPr>
+              <w:t>2</w:t>
+            </w:r>
+          </w:p>
+          <w:p>
+            <w:pPr>
+              <w:pStyle w:val="Paragrafoelenco"/>
+              <w:numPr>
+                <w:ilvl w:val="0"/>
+                <w:numId w:val="2"/>
+              </w:numPr>
+              <w:tabs>
+                <w:tab w:val="left" w:pos="2916"/>
+              </w:tabs>
+              <w:rPr>
+                <w:rFonts w:asciiTheme="majorHAnsi" w:hAnsiTheme="majorHAnsi"/>
+              </w:rPr>
+            </w:pPr>
+            <w:r>
+              <w:rPr>
+                <w:rFonts w:asciiTheme="majorHAnsi" w:hAnsiTheme="majorHAnsi"/>
+                <w:b/>
+                <w:bCs/>
+              </w:rPr>
+              <w:t>Pedonale:</w:t>
+            </w:r>
+            <w:r>
+              <w:rPr>
+                <w:rFonts w:asciiTheme="majorHAnsi" w:hAnsiTheme="majorHAnsi"/>
+              </w:rPr>
+              <w:t xml:space="preserve"> Rosso</w:t>
+            </w:r>
+            <w:r>
+              <w:rPr>
+                <w:rFonts w:ascii="Arial" w:hAnsi="Arial" w:cs="Arial"/>
+              </w:rPr>
+              <w:t> </w:t>
+            </w:r>
+            <w:r>
+              <w:rPr>
+                <w:rFonts w:asciiTheme="majorHAnsi" w:hAnsiTheme="majorHAnsi"/>
+              </w:rPr>
+              <w:t>7, Verde</w:t>
+            </w:r>
+            <w:r>
+              <w:rPr>
+                <w:rFonts w:ascii="Arial" w:hAnsi="Arial" w:cs="Arial"/>
+              </w:rPr>
+              <w:t> </w:t>
+            </w:r>
+            <w:r>
+              <w:rPr>
+                <w:rFonts w:asciiTheme="majorHAnsi" w:hAnsiTheme="majorHAnsi"/>
+              </w:rPr>
+              <w:t>6</w:t>
+            </w:r>
+          </w:p>
+          <w:p>
+            <w:pPr>
+              <w:pStyle w:val="Paragrafoelenco"/>
+              <w:numPr>
+                <w:ilvl w:val="0"/>
+                <w:numId w:val="2"/>
+              </w:numPr>
+              <w:tabs>
+                <w:tab w:val="left" w:pos="2916"/>
+              </w:tabs>
+              <w:rPr>
+                <w:rFonts w:asciiTheme="majorHAnsi" w:hAnsiTheme="majorHAnsi"/>
+              </w:rPr>
+            </w:pPr>
+            <w:r>
+              <w:rPr>
+                <w:rFonts w:asciiTheme="majorHAnsi" w:hAnsiTheme="majorHAnsi"/>
+                <w:b/>
+                <w:bCs/>
+              </w:rPr>
+              <w:t>Pulsante:</w:t>
+            </w:r>
+            <w:r>
+              <w:rPr>
+                <w:rFonts w:asciiTheme="majorHAnsi" w:hAnsiTheme="majorHAnsi"/>
+              </w:rPr>
+              <w:t xml:space="preserve"> 5</w:t>
+            </w:r>
           </w:p>
         </w:tc>
       </w:tr>
@@ -1275,15 +2378,151 @@
           </w:tcPr>
           <w:p>
             <w:pPr>
+              <w:pStyle w:val="Paragrafoelenco"/>
+              <w:numPr>
+                <w:ilvl w:val="0"/>
+                <w:numId w:val="1"/>
+              </w:numPr>
               <w:spacing w:before="167"/>
-              <w:ind w:left="409"/>
-              <w:jc w:val="center"/>
+              <w:rPr>
+                <w:rFonts w:ascii="Tahoma" w:hAnsi="Tahoma" w:cs="Tahoma"/>
+                <w:bCs/>
+              </w:rPr>
+            </w:pPr>
+            <w:r>
+              <w:rPr>
+                <w:rFonts w:ascii="Tahoma" w:hAnsi="Tahoma" w:cs="Tahoma"/>
+                <w:bCs/>
+              </w:rPr>
+              <w:t>1 scheda Arduino Uno</w:t>
+            </w:r>
+          </w:p>
+          <w:p>
+            <w:pPr>
+              <w:pStyle w:val="Paragrafoelenco"/>
+              <w:numPr>
+                <w:ilvl w:val="0"/>
+                <w:numId w:val="1"/>
+              </w:numPr>
+              <w:spacing w:before="167"/>
+              <w:rPr>
+                <w:rFonts w:ascii="Tahoma" w:hAnsi="Tahoma" w:cs="Tahoma"/>
+                <w:bCs/>
+              </w:rPr>
+            </w:pPr>
+            <w:r>
+              <w:rPr>
+                <w:rFonts w:ascii="Tahoma" w:hAnsi="Tahoma" w:cs="Tahoma"/>
+                <w:bCs/>
+              </w:rPr>
+              <w:t>Breadboard</w:t>
+            </w:r>
+          </w:p>
+          <w:p>
+            <w:pPr>
+              <w:pStyle w:val="Paragrafoelenco"/>
+              <w:numPr>
+                <w:ilvl w:val="0"/>
+                <w:numId w:val="1"/>
+              </w:numPr>
+              <w:spacing w:before="167"/>
+              <w:rPr>
+                <w:rFonts w:ascii="Tahoma" w:hAnsi="Tahoma" w:cs="Tahoma"/>
+                <w:bCs/>
+              </w:rPr>
+            </w:pPr>
+            <w:r>
+              <w:rPr>
+                <w:rFonts w:ascii="Tahoma" w:hAnsi="Tahoma" w:cs="Tahoma"/>
+                <w:bCs/>
+              </w:rPr>
+              <w:t>8 LED (rossi, gialli, verdi)</w:t>
+            </w:r>
+          </w:p>
+          <w:p>
+            <w:pPr>
+              <w:pStyle w:val="Paragrafoelenco"/>
+              <w:numPr>
+                <w:ilvl w:val="0"/>
+                <w:numId w:val="1"/>
+              </w:numPr>
+              <w:spacing w:before="167"/>
+              <w:rPr>
+                <w:rFonts w:ascii="Tahoma" w:hAnsi="Tahoma" w:cs="Tahoma"/>
+                <w:bCs/>
+              </w:rPr>
+            </w:pPr>
+            <w:r>
+              <w:rPr>
+                <w:rFonts w:ascii="Tahoma" w:hAnsi="Tahoma" w:cs="Tahoma"/>
+                <w:bCs/>
+              </w:rPr>
+              <w:t>8 resistenze da 220 Ω</w:t>
+            </w:r>
+          </w:p>
+          <w:p>
+            <w:pPr>
+              <w:pStyle w:val="Paragrafoelenco"/>
+              <w:numPr>
+                <w:ilvl w:val="0"/>
+                <w:numId w:val="1"/>
+              </w:numPr>
+              <w:spacing w:before="167"/>
+              <w:rPr>
+                <w:rFonts w:ascii="Tahoma" w:hAnsi="Tahoma" w:cs="Tahoma"/>
+                <w:bCs/>
+              </w:rPr>
+            </w:pPr>
+            <w:r>
+              <w:rPr>
+                <w:rFonts w:ascii="Tahoma" w:hAnsi="Tahoma" w:cs="Tahoma"/>
+                <w:bCs/>
+              </w:rPr>
+              <w:t>1 pulsante</w:t>
+            </w:r>
+          </w:p>
+          <w:p>
+            <w:pPr>
+              <w:pStyle w:val="Paragrafoelenco"/>
+              <w:numPr>
+                <w:ilvl w:val="0"/>
+                <w:numId w:val="1"/>
+              </w:numPr>
+              <w:spacing w:before="167"/>
+              <w:rPr>
+                <w:rFonts w:ascii="Tahoma" w:hAnsi="Tahoma" w:cs="Tahoma"/>
+                <w:bCs/>
+              </w:rPr>
+            </w:pPr>
+            <w:r>
+              <w:rPr>
+                <w:rFonts w:ascii="Tahoma" w:hAnsi="Tahoma" w:cs="Tahoma"/>
+                <w:bCs/>
+              </w:rPr>
+              <w:t>Cavetti jumper</w:t>
+            </w:r>
+          </w:p>
+          <w:p>
+            <w:pPr>
+              <w:pStyle w:val="Paragrafoelenco"/>
+              <w:numPr>
+                <w:ilvl w:val="0"/>
+                <w:numId w:val="1"/>
+              </w:numPr>
+              <w:spacing w:before="167"/>
               <w:rPr>
                 <w:rFonts w:ascii="Verdana"/>
                 <w:b/>
                 <w:sz w:val="28"/>
               </w:rPr>
             </w:pPr>
+            <w:r>
+              <w:rPr>
+                <w:rFonts w:ascii="Tahoma" w:hAnsi="Tahoma" w:cs="Tahoma"/>
+                <w:bCs/>
+              </w:rPr>
+              <w:t>PC con simulatore Tinkercad</w:t>
+            </w:r>
           </w:p>
         </w:tc>
       </w:tr>
@@ -1380,13 +2619,218 @@
           <w:p>
             <w:pPr>
               <w:ind w:left="462"/>
-              <w:jc w:val="center"/>
-              <w:rPr>
-                <w:rFonts w:asciiTheme="majorHAnsi" w:hAnsiTheme="majorHAnsi"/>
-                <w:sz w:val="28"/>
-                <w:szCs w:val="28"/>
+              <w:rPr>
+                <w:rFonts w:ascii="Tahoma" w:hAnsi="Tahoma" w:cs="Tahoma"/>
               </w:rPr>
             </w:pPr>
+            <w:r>
+              <w:rPr>
+                <w:rFonts w:ascii="Tahoma" w:hAnsi="Tahoma" w:cs="Tahoma"/>
+              </w:rPr>
+              <w:br/>
+            </w:r>
+            <w:r>
+              <w:rPr>
+                <w:rFonts w:ascii="Tahoma" w:hAnsi="Tahoma" w:cs="Tahoma"/>
+              </w:rPr>
+              <w:t xml:space="preserve">La prova è stata eseguita iniziando dal montaggio del circuito su breadboard. Ogni LED è stato collegato a un pin digitale della scheda Arduino Uno tramite una resistenza da 220 Ω in serie, necessaria per limitare la corrente e proteggere sia il LED sia il microcontrollore. Anche il pulsante è stato collegato correttamente al pin </w:t>
+            </w:r>
+            <w:proofErr w:type="gramStart"/>
+            <w:r>
+              <w:rPr>
+                <w:rFonts w:ascii="Tahoma" w:hAnsi="Tahoma" w:cs="Tahoma"/>
+              </w:rPr>
+              <w:t>5</w:t>
+            </w:r>
+            <w:proofErr w:type="gramEnd"/>
+            <w:r>
+              <w:rPr>
+                <w:rFonts w:ascii="Tahoma" w:hAnsi="Tahoma" w:cs="Tahoma"/>
+              </w:rPr>
+              <w:t xml:space="preserve"> e configurato nel programma come INPUT_PULLUP, quindi normalmente il pin legge livello logico HIGH e quando il pulsante viene premuto legge LOW.</w:t>
+            </w:r>
+          </w:p>
+          <w:p>
+            <w:pPr>
+              <w:ind w:left="462"/>
+              <w:rPr>
+                <w:rFonts w:ascii="Tahoma" w:hAnsi="Tahoma" w:cs="Tahoma"/>
+              </w:rPr>
+            </w:pPr>
+            <w:r>
+              <w:rPr>
+                <w:rFonts w:ascii="Tahoma" w:hAnsi="Tahoma" w:cs="Tahoma"/>
+              </w:rPr>
+              <w:t xml:space="preserve">Dopo aver completato il montaggio si è proceduto al caricamento del programma sulla scheda Arduino. Il codice è strutturato come una macchina a stati finiti (Finite State Machine), dove ogni stato rappresenta una fase del semaforo. Il tempo non è stato gestito con la funzione </w:t>
+            </w:r>
+            <w:proofErr w:type="gramStart"/>
+            <w:r>
+              <w:rPr>
+                <w:rFonts w:ascii="Tahoma" w:hAnsi="Tahoma" w:cs="Tahoma"/>
+              </w:rPr>
+              <w:t>delay(</w:t>
+            </w:r>
+            <w:proofErr w:type="gramEnd"/>
+            <w:r>
+              <w:rPr>
+                <w:rFonts w:ascii="Tahoma" w:hAnsi="Tahoma" w:cs="Tahoma"/>
+              </w:rPr>
+              <w:t xml:space="preserve">), ma con </w:t>
+            </w:r>
+            <w:proofErr w:type="spellStart"/>
+            <w:proofErr w:type="gramStart"/>
+            <w:r>
+              <w:rPr>
+                <w:rFonts w:ascii="Tahoma" w:hAnsi="Tahoma" w:cs="Tahoma"/>
+              </w:rPr>
+              <w:t>millis</w:t>
+            </w:r>
+            <w:proofErr w:type="spellEnd"/>
+            <w:r>
+              <w:rPr>
+                <w:rFonts w:ascii="Tahoma" w:hAnsi="Tahoma" w:cs="Tahoma"/>
+              </w:rPr>
+              <w:t>(</w:t>
+            </w:r>
+            <w:proofErr w:type="gramEnd"/>
+            <w:r>
+              <w:rPr>
+                <w:rFonts w:ascii="Tahoma" w:hAnsi="Tahoma" w:cs="Tahoma"/>
+              </w:rPr>
+              <w:t>), che permette una gestione non bloccante delle temporizzazioni.</w:t>
+            </w:r>
+          </w:p>
+          <w:p>
+            <w:pPr>
+              <w:ind w:left="462"/>
+              <w:rPr>
+                <w:rFonts w:ascii="Tahoma" w:hAnsi="Tahoma" w:cs="Tahoma"/>
+              </w:rPr>
+            </w:pPr>
+            <w:r>
+              <w:rPr>
+                <w:rFonts w:ascii="Tahoma" w:hAnsi="Tahoma" w:cs="Tahoma"/>
+              </w:rPr>
+              <w:t xml:space="preserve">All’avvio del sistema l’incrocio 1 risulta verde mentre l’incrocio 2 è rosso e il semaforo pedonale è rosso. </w:t>
+            </w:r>
+            <w:r>
+              <w:rPr>
+                <w:rFonts w:ascii="Tahoma" w:hAnsi="Tahoma" w:cs="Tahoma"/>
+              </w:rPr>
+              <w:t>Dopo 5 secondi,</w:t>
+            </w:r>
+            <w:r>
+              <w:rPr>
+                <w:rFonts w:ascii="Tahoma" w:hAnsi="Tahoma" w:cs="Tahoma"/>
+              </w:rPr>
+              <w:t xml:space="preserve"> il primo incrocio passa a giallo per 2 secondi. Se non viene premuto il pulsante, il sistema attiva il verde per l’incrocio 2 per 5 secondi, seguito dal giallo di 2 secondi, e poi ritorna allo stato iniziale ripetendo il ciclo. Se durante una qualsiasi fase viene premuto il pulsante, la variabile richiesta viene impostata a </w:t>
+            </w:r>
+            <w:proofErr w:type="spellStart"/>
+            <w:r>
+              <w:rPr>
+                <w:rFonts w:ascii="Tahoma" w:hAnsi="Tahoma" w:cs="Tahoma"/>
+              </w:rPr>
+              <w:t>true</w:t>
+            </w:r>
+            <w:proofErr w:type="spellEnd"/>
+            <w:r>
+              <w:rPr>
+                <w:rFonts w:ascii="Tahoma" w:hAnsi="Tahoma" w:cs="Tahoma"/>
+              </w:rPr>
+              <w:t xml:space="preserve">; alla fine della fase in corso entrambi gli incroci vengono portati a rosso e si attiva il verde pedonale per </w:t>
+            </w:r>
+            <w:proofErr w:type="gramStart"/>
+            <w:r>
+              <w:rPr>
+                <w:rFonts w:ascii="Tahoma" w:hAnsi="Tahoma" w:cs="Tahoma"/>
+              </w:rPr>
+              <w:t>5</w:t>
+            </w:r>
+            <w:proofErr w:type="gramEnd"/>
+            <w:r>
+              <w:rPr>
+                <w:rFonts w:ascii="Tahoma" w:hAnsi="Tahoma" w:cs="Tahoma"/>
+              </w:rPr>
+              <w:t xml:space="preserve"> secondi.</w:t>
+            </w:r>
+          </w:p>
+          <w:p>
+            <w:pPr>
+              <w:ind w:left="462"/>
+              <w:rPr>
+                <w:rFonts w:ascii="Tahoma" w:hAnsi="Tahoma" w:cs="Tahoma"/>
+              </w:rPr>
+            </w:pPr>
+            <w:r>
+              <w:rPr>
+                <w:rFonts w:ascii="Tahoma" w:hAnsi="Tahoma" w:cs="Tahoma"/>
+              </w:rPr>
+              <w:t>Durante la simulazione su Tinkercad i tempi di accensione dei LED e la sequenza degli stati coincidono con quelli programmati, cioè 5 secondi per il verde veicolare, 2 secondi per il giallo e 5 secondi per il verde pedonale. La corrente teorica per ogni LED è di circa 13,6 </w:t>
+            </w:r>
+            <w:proofErr w:type="spellStart"/>
+            <w:r>
+              <w:rPr>
+                <w:rFonts w:ascii="Tahoma" w:hAnsi="Tahoma" w:cs="Tahoma"/>
+              </w:rPr>
+              <w:t>mA</w:t>
+            </w:r>
+            <w:proofErr w:type="spellEnd"/>
+            <w:r>
+              <w:rPr>
+                <w:rFonts w:ascii="Tahoma" w:hAnsi="Tahoma" w:cs="Tahoma"/>
+              </w:rPr>
+              <w:t>, valore entro i limiti di sicurezza dei pin digitali di Arduino.</w:t>
+            </w:r>
+          </w:p>
+          <w:p>
+            <w:pPr>
+              <w:ind w:left="462"/>
+              <w:rPr>
+                <w:rFonts w:ascii="Tahoma" w:hAnsi="Tahoma" w:cs="Tahoma"/>
+              </w:rPr>
+            </w:pPr>
+            <w:r>
+              <w:rPr>
+                <w:rFonts w:ascii="Tahoma" w:hAnsi="Tahoma" w:cs="Tahoma"/>
+              </w:rPr>
+              <w:t xml:space="preserve">Il sistema funziona correttamente sia dal punto di vista logico sia elettrico, senza conflitti tra i due incroci. L’utilizzo della funzione </w:t>
+            </w:r>
+            <w:proofErr w:type="spellStart"/>
+            <w:proofErr w:type="gramStart"/>
+            <w:r>
+              <w:rPr>
+                <w:rFonts w:ascii="Tahoma" w:hAnsi="Tahoma" w:cs="Tahoma"/>
+              </w:rPr>
+              <w:t>millis</w:t>
+            </w:r>
+            <w:proofErr w:type="spellEnd"/>
+            <w:r>
+              <w:rPr>
+                <w:rFonts w:ascii="Tahoma" w:hAnsi="Tahoma" w:cs="Tahoma"/>
+              </w:rPr>
+              <w:t>(</w:t>
+            </w:r>
+            <w:proofErr w:type="gramEnd"/>
+            <w:r>
+              <w:rPr>
+                <w:rFonts w:ascii="Tahoma" w:hAnsi="Tahoma" w:cs="Tahoma"/>
+              </w:rPr>
+              <w:t xml:space="preserve">) rappresenta una scelta tecnicamente più corretta rispetto a </w:t>
+            </w:r>
+            <w:proofErr w:type="gramStart"/>
+            <w:r>
+              <w:rPr>
+                <w:rFonts w:ascii="Tahoma" w:hAnsi="Tahoma" w:cs="Tahoma"/>
+              </w:rPr>
+              <w:t>delay(</w:t>
+            </w:r>
+            <w:proofErr w:type="gramEnd"/>
+            <w:r>
+              <w:rPr>
+                <w:rFonts w:ascii="Tahoma" w:hAnsi="Tahoma" w:cs="Tahoma"/>
+              </w:rPr>
+              <w:t>), perché consente una gestione asincrona degli eventi e rende il programma più strutturato.</w:t>
+            </w:r>
           </w:p>
         </w:tc>
       </w:tr>
@@ -2227,13 +3671,12 @@
                 <w:rFonts w:asciiTheme="majorHAnsi" w:hAnsiTheme="majorHAnsi"/>
               </w:rPr>
             </w:pPr>
-          </w:p>
-          <w:p>
-            <w:pPr>
-              <w:rPr>
-                <w:rFonts w:asciiTheme="majorHAnsi" w:hAnsiTheme="majorHAnsi"/>
-              </w:rPr>
-            </w:pPr>
+            <w:r>
+              <w:rPr>
+                <w:rFonts w:asciiTheme="majorHAnsi" w:hAnsiTheme="majorHAnsi"/>
+              </w:rPr>
+              <w:t>Gessa Stefano Nicola</w:t>
+            </w:r>
           </w:p>
         </w:tc>
         <w:tc>
@@ -2258,6 +3701,12 @@
                 <w:rFonts w:asciiTheme="majorHAnsi" w:hAnsiTheme="majorHAnsi"/>
               </w:rPr>
             </w:pPr>
+            <w:r>
+              <w:rPr>
+                <w:rFonts w:asciiTheme="majorHAnsi" w:hAnsiTheme="majorHAnsi"/>
+              </w:rPr>
+              <w:t>Cabitza Enrico</w:t>
+            </w:r>
           </w:p>
         </w:tc>
       </w:tr>
@@ -2453,7 +3902,25 @@
         <w:rPr>
           <w:rFonts w:asciiTheme="majorHAnsi" w:hAnsiTheme="majorHAnsi"/>
         </w:rPr>
-        <w:t xml:space="preserve">                                                                                                                 </w:t>
+        <w:t xml:space="preserve">                        </w:t>
+      </w:r>
+      <w:r>
+        <w:rPr>
+          <w:rFonts w:asciiTheme="majorHAnsi" w:hAnsiTheme="majorHAnsi"/>
+        </w:rPr>
+        <w:t>01/03/2026</w:t>
+      </w:r>
+      <w:r>
+        <w:rPr>
+          <w:rFonts w:asciiTheme="majorHAnsi" w:hAnsiTheme="majorHAnsi"/>
+        </w:rPr>
+        <w:t xml:space="preserve">                                                                               </w:t>
+      </w:r>
+      <w:r>
+        <w:rPr>
+          <w:rFonts w:asciiTheme="majorHAnsi" w:hAnsiTheme="majorHAnsi"/>
+        </w:rPr>
+        <w:t xml:space="preserve">                                                    Porcu Matteo</w:t>
       </w:r>
     </w:p>
     <w:sectPr>
@@ -2464,6 +3931,243 @@
     </w:sectPr>
   </w:body>
 </w:document>
+</file>
+
+<file path=word/numbering.xml><?xml version="1.0" encoding="utf-8"?>
+<w:numbering xmlns:wpc="http://schemas.microsoft.com/office/word/2010/wordprocessingCanvas" xmlns:cx="http://schemas.microsoft.com/office/drawing/2014/chartex" xmlns:cx1="http://schemas.microsoft.com/office/drawing/2015/9/8/chartex" xmlns:cx2="http://schemas.microsoft.com/office/drawing/2015/10/21/chartex" xmlns:cx3="http://schemas.microsoft.com/office/drawing/2016/5/9/chartex" xmlns:cx4="http://schemas.microsoft.com/office/drawing/2016/5/10/chartex" xmlns:cx5="http://schemas.microsoft.com/office/drawing/2016/5/11/chartex" xmlns:cx6="http://schemas.microsoft.com/office/drawing/2016/5/12/chartex" xmlns:cx7="http://schemas.microsoft.com/office/drawing/2016/5/13/chartex" xmlns:cx8="http://schemas.microsoft.com/office/drawing/2016/5/14/chartex" xmlns:mc="http://schemas.openxmlformats.org/markup-compatibility/2006" xmlns:aink="http://schemas.microsoft.com/office/drawing/2016/ink" xmlns:am3d="http://schemas.microsoft.com/office/drawing/2017/model3d" xmlns:o="urn:schemas-microsoft-com:office:office" xmlns:oel="http://schemas.microsoft.com/office/2019/extlst" xmlns:r="http://schemas.openxmlformats.org/officeDocument/2006/relationships" xmlns:m="http://schemas.openxmlformats.org/officeDocument/2006/math" xmlns:v="urn:schemas-microsoft-com:vml" xmlns:wp14="http://schemas.microsoft.com/office/word/2010/wordprocessingDrawing" xmlns:wp="http://schemas.openxmlformats.org/drawingml/2006/wordprocessingDrawing" xmlns:w10="urn:schemas-microsoft-com:office:word" xmlns:w="http://schemas.openxmlformats.org/wordprocessingml/2006/main" xmlns:w14="http://schemas.microsoft.com/office/word/2010/wordml" xmlns:w15="http://schemas.microsoft.com/office/word/2012/wordml" xmlns:w16cex="http://schemas.microsoft.com/office/word/2018/wordml/cex" xmlns:w16cid="http://schemas.microsoft.com/office/word/2016/wordml/cid" xmlns:w16="http://schemas.microsoft.com/office/word/2018/wordml" xmlns:w16du="http://schemas.microsoft.com/office/word/2023/wordml/word16du" xmlns:w16sdtdh="http://schemas.microsoft.com/office/word/2020/wordml/sdtdatahash" xmlns:w16sdtfl="http://schemas.microsoft.com/office/word/2024/wordml/sdtformatlock" xmlns:w16se="http://schemas.microsoft.com/office/word/2015/wordml/symex" xmlns:wpg="http://schemas.microsoft.com/office/word/2010/wordprocessingGroup" xmlns:wpi="http://schemas.microsoft.com/office/word/2010/wordprocessingInk" xmlns:wne="http://schemas.microsoft.com/office/word/2006/wordml" xmlns:wps="http://schemas.microsoft.com/office/word/2010/wordprocessingShape" mc:Ignorable="w14 w15 w16se w16cid w16 w16cex w16sdtdh w16sdtfl w16du wp14">
+  <w:abstractNum w:abstractNumId="0" w15:restartNumberingAfterBreak="0">
+    <w:nsid w:val="539540B6"/>
+    <w:multiLevelType w:val="hybridMultilevel"/>
+    <w:tmpl w:val="7E6C94C0"/>
+    <w:lvl w:ilvl="0" w:tplc="04100001">
+      <w:start w:val="1"/>
+      <w:numFmt w:val="bullet"/>
+      <w:lvlText w:val=""/>
+      <w:lvlJc w:val="left"/>
+      <w:pPr>
+        <w:ind w:left="1129" w:hanging="360"/>
+      </w:pPr>
+      <w:rPr>
+        <w:rFonts w:ascii="Symbol" w:hAnsi="Symbol" w:hint="default"/>
+      </w:rPr>
+    </w:lvl>
+    <w:lvl w:ilvl="1" w:tplc="04100003" w:tentative="1">
+      <w:start w:val="1"/>
+      <w:numFmt w:val="bullet"/>
+      <w:lvlText w:val="o"/>
+      <w:lvlJc w:val="left"/>
+      <w:pPr>
+        <w:ind w:left="1849" w:hanging="360"/>
+      </w:pPr>
+      <w:rPr>
+        <w:rFonts w:ascii="Courier New" w:hAnsi="Courier New" w:cs="Courier New" w:hint="default"/>
+      </w:rPr>
+    </w:lvl>
+    <w:lvl w:ilvl="2" w:tplc="04100005" w:tentative="1">
+      <w:start w:val="1"/>
+      <w:numFmt w:val="bullet"/>
+      <w:lvlText w:val=""/>
+      <w:lvlJc w:val="left"/>
+      <w:pPr>
+        <w:ind w:left="2569" w:hanging="360"/>
+      </w:pPr>
+      <w:rPr>
+        <w:rFonts w:ascii="Wingdings" w:hAnsi="Wingdings" w:hint="default"/>
+      </w:rPr>
+    </w:lvl>
+    <w:lvl w:ilvl="3" w:tplc="04100001" w:tentative="1">
+      <w:start w:val="1"/>
+      <w:numFmt w:val="bullet"/>
+      <w:lvlText w:val=""/>
+      <w:lvlJc w:val="left"/>
+      <w:pPr>
+        <w:ind w:left="3289" w:hanging="360"/>
+      </w:pPr>
+      <w:rPr>
+        <w:rFonts w:ascii="Symbol" w:hAnsi="Symbol" w:hint="default"/>
+      </w:rPr>
+    </w:lvl>
+    <w:lvl w:ilvl="4" w:tplc="04100003" w:tentative="1">
+      <w:start w:val="1"/>
+      <w:numFmt w:val="bullet"/>
+      <w:lvlText w:val="o"/>
+      <w:lvlJc w:val="left"/>
+      <w:pPr>
+        <w:ind w:left="4009" w:hanging="360"/>
+      </w:pPr>
+      <w:rPr>
+        <w:rFonts w:ascii="Courier New" w:hAnsi="Courier New" w:cs="Courier New" w:hint="default"/>
+      </w:rPr>
+    </w:lvl>
+    <w:lvl w:ilvl="5" w:tplc="04100005" w:tentative="1">
+      <w:start w:val="1"/>
+      <w:numFmt w:val="bullet"/>
+      <w:lvlText w:val=""/>
+      <w:lvlJc w:val="left"/>
+      <w:pPr>
+        <w:ind w:left="4729" w:hanging="360"/>
+      </w:pPr>
+      <w:rPr>
+        <w:rFonts w:ascii="Wingdings" w:hAnsi="Wingdings" w:hint="default"/>
+      </w:rPr>
+    </w:lvl>
+    <w:lvl w:ilvl="6" w:tplc="04100001" w:tentative="1">
+      <w:start w:val="1"/>
+      <w:numFmt w:val="bullet"/>
+      <w:lvlText w:val=""/>
+      <w:lvlJc w:val="left"/>
+      <w:pPr>
+        <w:ind w:left="5449" w:hanging="360"/>
+      </w:pPr>
+      <w:rPr>
+        <w:rFonts w:ascii="Symbol" w:hAnsi="Symbol" w:hint="default"/>
+      </w:rPr>
+    </w:lvl>
+    <w:lvl w:ilvl="7" w:tplc="04100003" w:tentative="1">
+      <w:start w:val="1"/>
+      <w:numFmt w:val="bullet"/>
+      <w:lvlText w:val="o"/>
+      <w:lvlJc w:val="left"/>
+      <w:pPr>
+        <w:ind w:left="6169" w:hanging="360"/>
+      </w:pPr>
+      <w:rPr>
+        <w:rFonts w:ascii="Courier New" w:hAnsi="Courier New" w:cs="Courier New" w:hint="default"/>
+      </w:rPr>
+    </w:lvl>
+    <w:lvl w:ilvl="8" w:tplc="04100005" w:tentative="1">
+      <w:start w:val="1"/>
+      <w:numFmt w:val="bullet"/>
+      <w:lvlText w:val=""/>
+      <w:lvlJc w:val="left"/>
+      <w:pPr>
+        <w:ind w:left="6889" w:hanging="360"/>
+      </w:pPr>
+      <w:rPr>
+        <w:rFonts w:ascii="Wingdings" w:hAnsi="Wingdings" w:hint="default"/>
+      </w:rPr>
+    </w:lvl>
+  </w:abstractNum>
+  <w:abstractNum w:abstractNumId="1" w15:restartNumberingAfterBreak="0">
+    <w:nsid w:val="6AEE7CCA"/>
+    <w:multiLevelType w:val="hybridMultilevel"/>
+    <w:tmpl w:val="5510A0E8"/>
+    <w:lvl w:ilvl="0" w:tplc="04100001">
+      <w:start w:val="1"/>
+      <w:numFmt w:val="bullet"/>
+      <w:lvlText w:val=""/>
+      <w:lvlJc w:val="left"/>
+      <w:pPr>
+        <w:ind w:left="720" w:hanging="360"/>
+      </w:pPr>
+      <w:rPr>
+        <w:rFonts w:ascii="Symbol" w:hAnsi="Symbol" w:hint="default"/>
+      </w:rPr>
+    </w:lvl>
+    <w:lvl w:ilvl="1" w:tplc="04100003" w:tentative="1">
+      <w:start w:val="1"/>
+      <w:numFmt w:val="bullet"/>
+      <w:lvlText w:val="o"/>
+      <w:lvlJc w:val="left"/>
+      <w:pPr>
+        <w:ind w:left="1440" w:hanging="360"/>
+      </w:pPr>
+      <w:rPr>
+        <w:rFonts w:ascii="Courier New" w:hAnsi="Courier New" w:cs="Courier New" w:hint="default"/>
+      </w:rPr>
+    </w:lvl>
+    <w:lvl w:ilvl="2" w:tplc="04100005" w:tentative="1">
+      <w:start w:val="1"/>
+      <w:numFmt w:val="bullet"/>
+      <w:lvlText w:val=""/>
+      <w:lvlJc w:val="left"/>
+      <w:pPr>
+        <w:ind w:left="2160" w:hanging="360"/>
+      </w:pPr>
+      <w:rPr>
+        <w:rFonts w:ascii="Wingdings" w:hAnsi="Wingdings" w:hint="default"/>
+      </w:rPr>
+    </w:lvl>
+    <w:lvl w:ilvl="3" w:tplc="04100001" w:tentative="1">
+      <w:start w:val="1"/>
+      <w:numFmt w:val="bullet"/>
+      <w:lvlText w:val=""/>
+      <w:lvlJc w:val="left"/>
+      <w:pPr>
+        <w:ind w:left="2880" w:hanging="360"/>
+      </w:pPr>
+      <w:rPr>
+        <w:rFonts w:ascii="Symbol" w:hAnsi="Symbol" w:hint="default"/>
+      </w:rPr>
+    </w:lvl>
+    <w:lvl w:ilvl="4" w:tplc="04100003" w:tentative="1">
+      <w:start w:val="1"/>
+      <w:numFmt w:val="bullet"/>
+      <w:lvlText w:val="o"/>
+      <w:lvlJc w:val="left"/>
+      <w:pPr>
+        <w:ind w:left="3600" w:hanging="360"/>
+      </w:pPr>
+      <w:rPr>
+        <w:rFonts w:ascii="Courier New" w:hAnsi="Courier New" w:cs="Courier New" w:hint="default"/>
+      </w:rPr>
+    </w:lvl>
+    <w:lvl w:ilvl="5" w:tplc="04100005" w:tentative="1">
+      <w:start w:val="1"/>
+      <w:numFmt w:val="bullet"/>
+      <w:lvlText w:val=""/>
+      <w:lvlJc w:val="left"/>
+      <w:pPr>
+        <w:ind w:left="4320" w:hanging="360"/>
+      </w:pPr>
+      <w:rPr>
+        <w:rFonts w:ascii="Wingdings" w:hAnsi="Wingdings" w:hint="default"/>
+      </w:rPr>
+    </w:lvl>
+    <w:lvl w:ilvl="6" w:tplc="04100001" w:tentative="1">
+      <w:start w:val="1"/>
+      <w:numFmt w:val="bullet"/>
+      <w:lvlText w:val=""/>
+      <w:lvlJc w:val="left"/>
+      <w:pPr>
+        <w:ind w:left="5040" w:hanging="360"/>
+      </w:pPr>
+      <w:rPr>
+        <w:rFonts w:ascii="Symbol" w:hAnsi="Symbol" w:hint="default"/>
+      </w:rPr>
+    </w:lvl>
+    <w:lvl w:ilvl="7" w:tplc="04100003" w:tentative="1">
+      <w:start w:val="1"/>
+      <w:numFmt w:val="bullet"/>
+      <w:lvlText w:val="o"/>
+      <w:lvlJc w:val="left"/>
+      <w:pPr>
+        <w:ind w:left="5760" w:hanging="360"/>
+      </w:pPr>
+      <w:rPr>
+        <w:rFonts w:ascii="Courier New" w:hAnsi="Courier New" w:cs="Courier New" w:hint="default"/>
+      </w:rPr>
+    </w:lvl>
+    <w:lvl w:ilvl="8" w:tplc="04100005" w:tentative="1">
+      <w:start w:val="1"/>
+      <w:numFmt w:val="bullet"/>
+      <w:lvlText w:val=""/>
+      <w:lvlJc w:val="left"/>
+      <w:pPr>
+        <w:ind w:left="6480" w:hanging="360"/>
+      </w:pPr>
+      <w:rPr>
+        <w:rFonts w:ascii="Wingdings" w:hAnsi="Wingdings" w:hint="default"/>
+      </w:rPr>
+    </w:lvl>
+  </w:abstractNum>
+  <w:num w:numId="1" w16cid:durableId="467553480">
+    <w:abstractNumId w:val="0"/>
+  </w:num>
+  <w:num w:numId="2" w16cid:durableId="1658418513">
+    <w:abstractNumId w:val="1"/>
+  </w:num>
+</w:numbering>
 </file>
 
 <file path=word/styles.xml><?xml version="1.0" encoding="utf-8"?>
@@ -3069,7 +4773,6 @@
   <w:style w:type="character" w:default="1" w:styleId="Carpredefinitoparagrafo">
     <w:name w:val="Default Paragraph Font"/>
     <w:uiPriority w:val="1"/>
-    <w:semiHidden/>
     <w:unhideWhenUsed/>
   </w:style>
   <w:style w:type="table" w:default="1" w:styleId="Tabellanormale">
@@ -3445,6 +5148,122 @@
       <w14:ligatures w14:val="none"/>
     </w:rPr>
   </w:style>
+  <w:style w:type="paragraph" w:styleId="NormaleWeb">
+    <w:name w:val="Normal (Web)"/>
+    <w:basedOn w:val="Normale"/>
+    <w:uiPriority w:val="99"/>
+    <w:semiHidden/>
+    <w:unhideWhenUsed/>
+    <w:rsid w:val="00FF6639"/>
+    <w:rPr>
+      <w:rFonts w:ascii="Times New Roman" w:hAnsi="Times New Roman" w:cs="Times New Roman"/>
+    </w:rPr>
+  </w:style>
+  <w:style w:type="table" w:styleId="Elencochiaro-Colore3">
+    <w:name w:val="Light List Accent 3"/>
+    <w:basedOn w:val="Tabellanormale"/>
+    <w:uiPriority w:val="61"/>
+    <w:rsid w:val="00FF6639"/>
+    <w:pPr>
+      <w:spacing w:after="0" w:line="240" w:lineRule="auto"/>
+    </w:pPr>
+    <w:rPr>
+      <w:rFonts w:eastAsiaTheme="minorEastAsia"/>
+      <w:kern w:val="0"/>
+      <w:sz w:val="22"/>
+      <w:szCs w:val="22"/>
+      <w:lang w:eastAsia="it-IT"/>
+      <w14:ligatures w14:val="none"/>
+    </w:rPr>
+    <w:tblPr>
+      <w:tblStyleRowBandSize w:val="1"/>
+      <w:tblStyleColBandSize w:val="1"/>
+      <w:tblBorders>
+        <w:top w:val="single" w:sz="8" w:space="0" w:color="196B24" w:themeColor="accent3"/>
+        <w:left w:val="single" w:sz="8" w:space="0" w:color="196B24" w:themeColor="accent3"/>
+        <w:bottom w:val="single" w:sz="8" w:space="0" w:color="196B24" w:themeColor="accent3"/>
+        <w:right w:val="single" w:sz="8" w:space="0" w:color="196B24" w:themeColor="accent3"/>
+      </w:tblBorders>
+    </w:tblPr>
+    <w:tblStylePr w:type="firstRow">
+      <w:pPr>
+        <w:spacing w:before="0" w:after="0" w:line="240" w:lineRule="auto"/>
+      </w:pPr>
+      <w:rPr>
+        <w:b/>
+        <w:bCs/>
+        <w:color w:val="FFFFFF" w:themeColor="background1"/>
+      </w:rPr>
+      <w:tblPr/>
+      <w:tcPr>
+        <w:shd w:val="clear" w:color="auto" w:fill="196B24" w:themeFill="accent3"/>
+      </w:tcPr>
+    </w:tblStylePr>
+    <w:tblStylePr w:type="lastRow">
+      <w:pPr>
+        <w:spacing w:before="0" w:after="0" w:line="240" w:lineRule="auto"/>
+      </w:pPr>
+      <w:rPr>
+        <w:b/>
+        <w:bCs/>
+      </w:rPr>
+      <w:tblPr/>
+      <w:tcPr>
+        <w:tcBorders>
+          <w:top w:val="double" w:sz="6" w:space="0" w:color="196B24" w:themeColor="accent3"/>
+          <w:left w:val="single" w:sz="8" w:space="0" w:color="196B24" w:themeColor="accent3"/>
+          <w:bottom w:val="single" w:sz="8" w:space="0" w:color="196B24" w:themeColor="accent3"/>
+          <w:right w:val="single" w:sz="8" w:space="0" w:color="196B24" w:themeColor="accent3"/>
+        </w:tcBorders>
+      </w:tcPr>
+    </w:tblStylePr>
+    <w:tblStylePr w:type="firstCol">
+      <w:rPr>
+        <w:b/>
+        <w:bCs/>
+      </w:rPr>
+    </w:tblStylePr>
+    <w:tblStylePr w:type="lastCol">
+      <w:rPr>
+        <w:b/>
+        <w:bCs/>
+      </w:rPr>
+    </w:tblStylePr>
+    <w:tblStylePr w:type="band1Vert">
+      <w:tblPr/>
+      <w:tcPr>
+        <w:tcBorders>
+          <w:top w:val="single" w:sz="8" w:space="0" w:color="196B24" w:themeColor="accent3"/>
+          <w:left w:val="single" w:sz="8" w:space="0" w:color="196B24" w:themeColor="accent3"/>
+          <w:bottom w:val="single" w:sz="8" w:space="0" w:color="196B24" w:themeColor="accent3"/>
+          <w:right w:val="single" w:sz="8" w:space="0" w:color="196B24" w:themeColor="accent3"/>
+        </w:tcBorders>
+      </w:tcPr>
+    </w:tblStylePr>
+    <w:tblStylePr w:type="band1Horz">
+      <w:tblPr/>
+      <w:tcPr>
+        <w:tcBorders>
+          <w:top w:val="single" w:sz="8" w:space="0" w:color="196B24" w:themeColor="accent3"/>
+          <w:left w:val="single" w:sz="8" w:space="0" w:color="196B24" w:themeColor="accent3"/>
+          <w:bottom w:val="single" w:sz="8" w:space="0" w:color="196B24" w:themeColor="accent3"/>
+          <w:right w:val="single" w:sz="8" w:space="0" w:color="196B24" w:themeColor="accent3"/>
+        </w:tcBorders>
+      </w:tcPr>
+    </w:tblStylePr>
+  </w:style>
+  <w:style w:type="character" w:styleId="Collegamentovisitato">
+    <w:name w:val="FollowedHyperlink"/>
+    <w:basedOn w:val="Carpredefinitoparagrafo"/>
+    <w:uiPriority w:val="99"/>
+    <w:semiHidden/>
+    <w:unhideWhenUsed/>
+    <w:rsid w:val="00B27B9A"/>
+    <w:rPr>
+      <w:color w:val="96607D" w:themeColor="followedHyperlink"/>
+      <w:u w:val="single"/>
+    </w:rPr>
+  </w:style>
 </w:styles>
 </file>
 

</xml_diff>